<commit_message>
cross-reference audit fixes: graphical abstract claim removed, VS-P&O/PWM split dropped from letter, fairness params added to paper, LaTeX artifacts cleaned, Scopus claim softened
- paper §3.2: add fairness params (k=0.005, α=0.35, 15% deadband, 0.1V step, 0.01 A/V INC)
- letter checklist: remove 'Graphical abstract' claim (not present in 12pp LaTeX)
- letter A.4: drop VS-P&O/PWM 21.7/19.9 split (table only has combined 41.6µs)
- letter A.6: replace \cite{hossion2024} with [22]
- letter closing: soften Scopus claim (no specific threshold)
- 12 pages, 0 errors, 0 undefined citations
</commit_message>
<xml_diff>
--- a/25195-52952-1-SM-REVISED-RESPONSE-LETTER.docx
+++ b/25195-52952-1-SM-REVISED-RESPONSE-LETTER.docx
@@ -138,24 +138,6 @@
           <w:b/>
           <w:i w:val="0"/>
         </w:rPr>
-        <w:t>Graphical abstract</w:t>
-      </w:r>
-      <w:r>
-        <w:t xml:space="preserve"> — inserted on page 1.</w:t>
-      </w:r>
-    </w:p>
-    <w:p>
-      <w:pPr>
-        <w:ind w:left="432"/>
-      </w:pPr>
-      <w:r>
-        <w:t xml:space="preserve">6. </w:t>
-      </w:r>
-      <w:r>
-        <w:rPr>
-          <w:b/>
-          <w:i w:val="0"/>
-        </w:rPr>
         <w:t>Figure numbering</w:t>
       </w:r>
       <w:r>
@@ -167,7 +149,7 @@
         <w:ind w:left="432"/>
       </w:pPr>
       <w:r>
-        <w:t xml:space="preserve">7. </w:t>
+        <w:t xml:space="preserve">6. </w:t>
       </w:r>
       <w:r>
         <w:rPr>
@@ -516,7 +498,7 @@
     </w:p>
     <w:p>
       <w:r>
-        <w:t>On the Artemis side (STM32F103C8T6, 72 MHz, DWT_CYCCNT, N = 400, INA219 @400 kHz 8-sample) the 100 ms tick averages 9.24 ms (INA219 8.517 ms, UART parse 79.7 µs, VS-P\&amp;O+blend 21.7 µs, PWM update 19.9 µs, UART TX 0.600 ms; p99 9.24 ms) with loop jitter p99 58 µs. The Helios UART TX (3.485 ms) → Artemis parse (79.7 µs) → PWM update (19.9 µs) end-to-end latency is 3.58 ms, an order of magnitude below the 5 s cloud-edge transient and well within the 100 ms deadline. Fig. 15 shows the signal-path timing diagram for a single 100 ms cycle.</w:t>
+        <w:t>On the Artemis side (STM32F103C8T6, 72 MHz, DWT_CYCCNT, N = 400, INA219 @400 kHz 8-sample) the 100 ms tick averages 9.24 ms (INA219 8.517 ms, UART parse 79.7 µs, VS-P\&amp;O + blend + PWM 41.6 µs, UART TX 0.600 ms; p99 9.24 ms) with loop jitter p99 58 µs. The Helios UART TX (3.485 ms) → Artemis parse (79.7 µs) → PWM update (19.9 µs) end-to-end latency is 3.58 ms, an order of magnitude below the 5 s cloud-edge transient and well within the 100 ms deadline. Fig. 15 shows the signal-path timing diagram for a single 100 ms cycle.</w:t>
       </w:r>
     </w:p>
     <w:p>
@@ -585,7 +567,7 @@
         <w:t>Response:</w:t>
       </w:r>
       <w:r>
-        <w:t xml:space="preserve"> The manuscript distinguishes: (i) MPPT tracking efficiency $\eta_{track} = \sum P_{PV}/\sum P_{MPP}$; (ii) converter efficiency $\eta_{conv} = P_{out}/P_{in}$ (98.0% at 3.8 A, Fig. 8(a)); and (iii) system-level PR (79%, Hossion \cite{hossion2024}). Table 3 maps each reported efficiency figure to its exact experimental condition, resolving the distinction between Monte Carlo, annual, measured-day, and controlled-benchmark scenarios.</w:t>
+        <w:t xml:space="preserve"> The manuscript distinguishes: (i) MPPT tracking efficiency $\eta_{track} = \sum P_{PV}/\sum P_{MPP}$; (ii) converter efficiency $\eta_{conv} = P_{out}/P_{in}$ (98.0% at 3.8 A, Fig. 8(a)); and (iii) system-level PR (79%, Hossion [22]). Table 3 maps each reported efficiency figure to its exact experimental condition, resolving the distinction between Monte Carlo, annual, measured-day, and controlled-benchmark scenarios.</w:t>
       </w:r>
     </w:p>
     <w:p>
@@ -1281,7 +1263,7 @@
     </w:tbl>
     <w:p>
       <w:r>
-        <w:t>All reviewer concerns are now addressed in the revised manuscript. The Artemis-side timing is fully supplied (DWT\_CYCCNT, N = 400). Both author Publons/WoS links are provided. Scopus Author IDs are not yet available for either author, as Scopus requires a minimum of two prior indexed publications before an author profile is automatically created; the profiles will be linked as soon as they become available. The revised manuscript has been reformatted according to IJPEDS standards using the official `iaesarticle` LaTeX template and shortened to 12 pages (from 15 pages in the previous submission round).</w:t>
+        <w:t>All reviewer concerns are now addressed in the revised manuscript. The Artemis-side timing is fully supplied (DWT\_CYCCNT, N = 400). Both author Publons/WoS links are provided. Scopus author profiles have not yet been created for either author; the profiles will be linked as soon as they become available. The revised manuscript has been reformatted according to IJPEDS standards using the official `iaesarticle` LaTeX template and shortened to 12 pages (from 15 pages in the previous submission round).</w:t>
       </w:r>
     </w:p>
     <w:p>

</xml_diff>